<commit_message>
Inicio de sección 2
</commit_message>
<xml_diff>
--- a/Avances pruebas del tutorial.docx
+++ b/Avances pruebas del tutorial.docx
@@ -796,6 +796,204 @@
           <w:rFonts w:ascii="Times New Roman" w:hAnsi="Times New Roman" w:cs="Times New Roman"/>
           <w:b/>
           <w:bCs/>
+        </w:rPr>
+      </w:pPr>
+    </w:p>
+    <w:p>
+      <w:pPr>
+        <w:jc w:val="both"/>
+        <w:rPr>
+          <w:rFonts w:ascii="Times New Roman" w:hAnsi="Times New Roman" w:cs="Times New Roman"/>
+          <w:b/>
+          <w:bCs/>
+        </w:rPr>
+      </w:pPr>
+      <w:r>
+        <w:rPr>
+          <w:rFonts w:ascii="Times New Roman" w:hAnsi="Times New Roman" w:cs="Times New Roman"/>
+          <w:b/>
+          <w:bCs/>
+        </w:rPr>
+        <w:t xml:space="preserve">Sección </w:t>
+      </w:r>
+      <w:r>
+        <w:rPr>
+          <w:rFonts w:ascii="Times New Roman" w:hAnsi="Times New Roman" w:cs="Times New Roman"/>
+          <w:b/>
+          <w:bCs/>
+        </w:rPr>
+        <w:t xml:space="preserve">2. Uso del </w:t>
+      </w:r>
+      <w:proofErr w:type="spellStart"/>
+      <w:r>
+        <w:rPr>
+          <w:rFonts w:ascii="Times New Roman" w:hAnsi="Times New Roman" w:cs="Times New Roman"/>
+          <w:b/>
+          <w:bCs/>
+        </w:rPr>
+        <w:t>toolchain</w:t>
+      </w:r>
+      <w:proofErr w:type="spellEnd"/>
+      <w:r>
+        <w:rPr>
+          <w:rFonts w:ascii="Times New Roman" w:hAnsi="Times New Roman" w:cs="Times New Roman"/>
+          <w:b/>
+          <w:bCs/>
+        </w:rPr>
+        <w:t xml:space="preserve"> para diseño en FPGA</w:t>
+      </w:r>
+    </w:p>
+    <w:p>
+      <w:pPr>
+        <w:jc w:val="both"/>
+        <w:rPr>
+          <w:rFonts w:ascii="Times New Roman" w:hAnsi="Times New Roman" w:cs="Times New Roman"/>
+        </w:rPr>
+      </w:pPr>
+      <w:r>
+        <w:rPr>
+          <w:rFonts w:ascii="Times New Roman" w:hAnsi="Times New Roman" w:cs="Times New Roman"/>
+        </w:rPr>
+        <w:t>Clonación y ubicación del repositorio</w:t>
+      </w:r>
+    </w:p>
+    <w:p>
+      <w:pPr>
+        <w:jc w:val="center"/>
+        <w:rPr>
+          <w:rFonts w:ascii="Times New Roman" w:hAnsi="Times New Roman" w:cs="Times New Roman"/>
+        </w:rPr>
+      </w:pPr>
+      <w:r>
+        <w:rPr>
+          <w:rFonts w:ascii="Times New Roman" w:hAnsi="Times New Roman" w:cs="Times New Roman"/>
+        </w:rPr>
+        <w:t xml:space="preserve">        </w:t>
+      </w:r>
+      <w:r>
+        <w:rPr>
+          <w:rFonts w:ascii="Times New Roman" w:hAnsi="Times New Roman" w:cs="Times New Roman"/>
+        </w:rPr>
+        <w:drawing>
+          <wp:inline distT="0" distB="0" distL="0" distR="0" wp14:anchorId="6C70678D" wp14:editId="2F4187C8">
+            <wp:extent cx="899238" cy="723963"/>
+            <wp:effectExtent l="0" t="0" r="0" b="0"/>
+            <wp:docPr id="1895793557" name="Imagen 1"/>
+            <wp:cNvGraphicFramePr>
+              <a:graphicFrameLocks xmlns:a="http://schemas.openxmlformats.org/drawingml/2006/main" noChangeAspect="1"/>
+            </wp:cNvGraphicFramePr>
+            <a:graphic xmlns:a="http://schemas.openxmlformats.org/drawingml/2006/main">
+              <a:graphicData uri="http://schemas.openxmlformats.org/drawingml/2006/picture">
+                <pic:pic xmlns:pic="http://schemas.openxmlformats.org/drawingml/2006/picture">
+                  <pic:nvPicPr>
+                    <pic:cNvPr id="1895793557" name=""/>
+                    <pic:cNvPicPr/>
+                  </pic:nvPicPr>
+                  <pic:blipFill>
+                    <a:blip r:embed="rId13"/>
+                    <a:stretch>
+                      <a:fillRect/>
+                    </a:stretch>
+                  </pic:blipFill>
+                  <pic:spPr>
+                    <a:xfrm>
+                      <a:off x="0" y="0"/>
+                      <a:ext cx="899238" cy="723963"/>
+                    </a:xfrm>
+                    <a:prstGeom prst="rect">
+                      <a:avLst/>
+                    </a:prstGeom>
+                  </pic:spPr>
+                </pic:pic>
+              </a:graphicData>
+            </a:graphic>
+          </wp:inline>
+        </w:drawing>
+      </w:r>
+      <w:r>
+        <w:rPr>
+          <w:rFonts w:ascii="Times New Roman" w:hAnsi="Times New Roman" w:cs="Times New Roman"/>
+        </w:rPr>
+        <w:t xml:space="preserve">                              </w:t>
+      </w:r>
+      <w:r>
+        <w:rPr>
+          <w:rFonts w:ascii="Times New Roman" w:hAnsi="Times New Roman" w:cs="Times New Roman"/>
+        </w:rPr>
+        <w:drawing>
+          <wp:inline distT="0" distB="0" distL="0" distR="0" wp14:anchorId="1548CE91" wp14:editId="15280268">
+            <wp:extent cx="2720340" cy="1147172"/>
+            <wp:effectExtent l="0" t="0" r="3810" b="0"/>
+            <wp:docPr id="1550398667" name="Imagen 1" descr="Interfaz de usuario gráfica, Texto, Aplicación, Correo electrónico&#10;&#10;El contenido generado por IA puede ser incorrecto."/>
+            <wp:cNvGraphicFramePr>
+              <a:graphicFrameLocks xmlns:a="http://schemas.openxmlformats.org/drawingml/2006/main" noChangeAspect="1"/>
+            </wp:cNvGraphicFramePr>
+            <a:graphic xmlns:a="http://schemas.openxmlformats.org/drawingml/2006/main">
+              <a:graphicData uri="http://schemas.openxmlformats.org/drawingml/2006/picture">
+                <pic:pic xmlns:pic="http://schemas.openxmlformats.org/drawingml/2006/picture">
+                  <pic:nvPicPr>
+                    <pic:cNvPr id="1550398667" name="Imagen 1" descr="Interfaz de usuario gráfica, Texto, Aplicación, Correo electrónico&#10;&#10;El contenido generado por IA puede ser incorrecto."/>
+                    <pic:cNvPicPr/>
+                  </pic:nvPicPr>
+                  <pic:blipFill>
+                    <a:blip r:embed="rId14"/>
+                    <a:stretch>
+                      <a:fillRect/>
+                    </a:stretch>
+                  </pic:blipFill>
+                  <pic:spPr>
+                    <a:xfrm>
+                      <a:off x="0" y="0"/>
+                      <a:ext cx="2723456" cy="1148486"/>
+                    </a:xfrm>
+                    <a:prstGeom prst="rect">
+                      <a:avLst/>
+                    </a:prstGeom>
+                  </pic:spPr>
+                </pic:pic>
+              </a:graphicData>
+            </a:graphic>
+          </wp:inline>
+        </w:drawing>
+      </w:r>
+    </w:p>
+    <w:p>
+      <w:pPr>
+        <w:jc w:val="center"/>
+        <w:rPr>
+          <w:rFonts w:ascii="Times New Roman" w:hAnsi="Times New Roman" w:cs="Times New Roman"/>
+        </w:rPr>
+      </w:pPr>
+    </w:p>
+    <w:p>
+      <w:pPr>
+        <w:jc w:val="center"/>
+        <w:rPr>
+          <w:rFonts w:ascii="Times New Roman" w:hAnsi="Times New Roman" w:cs="Times New Roman"/>
+        </w:rPr>
+      </w:pPr>
+    </w:p>
+    <w:p>
+      <w:pPr>
+        <w:jc w:val="center"/>
+        <w:rPr>
+          <w:rFonts w:ascii="Times New Roman" w:hAnsi="Times New Roman" w:cs="Times New Roman"/>
+        </w:rPr>
+      </w:pPr>
+    </w:p>
+    <w:p>
+      <w:pPr>
+        <w:jc w:val="center"/>
+        <w:rPr>
+          <w:rFonts w:ascii="Times New Roman" w:hAnsi="Times New Roman" w:cs="Times New Roman"/>
+        </w:rPr>
+      </w:pPr>
+    </w:p>
+    <w:p>
+      <w:pPr>
+        <w:jc w:val="center"/>
+        <w:rPr>
+          <w:rFonts w:ascii="Times New Roman" w:hAnsi="Times New Roman" w:cs="Times New Roman"/>
         </w:rPr>
       </w:pPr>
     </w:p>

</xml_diff>